<commit_message>
feat: añadir proyectos de investigación (Observatorio de Sostenibilidad y Ley de Turismo) y actualizar perfil de Carmen Barbero
</commit_message>
<xml_diff>
--- a/solicitud_pag_web.docx
+++ b/solicitud_pag_web.docx
@@ -477,10 +477,10 @@
               <w:rPr>
                 <w:rFonts w:ascii="Arial" w:hAnsi="Arial"/>
                 <w:b/>
-                <w:color w:val="000000"/>
+                <w:color w:val="006400"/>
                 <w:lang w:val="es-EC"/>
               </w:rPr>
-              <w:t xml:space="preserve"> ] HTML   </w:t>
+              <w:t xml:space="preserve">X] HTML   </w:t>
             </w:r>
             <w:r>
               <w:rPr>
@@ -495,10 +495,10 @@
               <w:rPr>
                 <w:rFonts w:ascii="Arial" w:hAnsi="Arial"/>
                 <w:b/>
-                <w:color w:val="006400"/>
+                <w:color w:val="000000"/>
                 <w:lang w:val="es-EC"/>
               </w:rPr>
-              <w:t xml:space="preserve">[X] Gestor de contenidos, indíquelo: </w:t>
+              <w:t xml:space="preserve">[ ] Gestor de contenidos, indíquelo: </w:t>
             </w:r>
             <w:r>
               <w:rPr>
@@ -533,36 +533,7 @@
                 <w:sz w:val="19"/>
                 <w:lang w:val="es-EC"/>
               </w:rPr>
-              <w:t xml:space="preserve">Base de datos MySQL dedicada (solicitada en paralelo), acceso SFTP/FTP para el mantenimiento del sitio, PHP versión 8.1 o superior, soporte para peticiones </w:t>
-            </w:r>
-            <w:proofErr w:type="spellStart"/>
-            <w:r>
-              <w:rPr>
-                <w:rFonts w:ascii="Arial" w:hAnsi="Arial"/>
-                <w:color w:val="000000"/>
-                <w:sz w:val="19"/>
-                <w:lang w:val="es-EC"/>
-              </w:rPr>
-              <w:t>c</w:t>
-            </w:r>
-            <w:r>
-              <w:rPr>
-                <w:rFonts w:ascii="Arial" w:hAnsi="Arial"/>
-                <w:color w:val="000000"/>
-                <w:sz w:val="19"/>
-                <w:lang w:val="es-EC"/>
-              </w:rPr>
-              <w:t>URL</w:t>
-            </w:r>
-            <w:proofErr w:type="spellEnd"/>
-            <w:r>
-              <w:rPr>
-                <w:rFonts w:ascii="Arial" w:hAnsi="Arial"/>
-                <w:color w:val="000000"/>
-                <w:sz w:val="19"/>
-                <w:lang w:val="es-EC"/>
-              </w:rPr>
-              <w:t xml:space="preserve"> externas salientes.</w:t>
+              <w:t xml:space="preserve">acceso SFTP/FTP para el mantenimiento del sitio.</w:t>
             </w:r>
           </w:p>
         </w:tc>
@@ -636,56 +607,7 @@
                 <w:sz w:val="19"/>
                 <w:lang w:val="es-EC"/>
               </w:rPr>
-              <w:t xml:space="preserve">Es fundamental que el servidor de alojamiento permita conexiones salientes </w:t>
-            </w:r>
-            <w:proofErr w:type="spellStart"/>
-            <w:r>
-              <w:rPr>
-                <w:rFonts w:ascii="Arial" w:hAnsi="Arial"/>
-                <w:color w:val="000000"/>
-                <w:sz w:val="19"/>
-                <w:lang w:val="es-EC"/>
-              </w:rPr>
-              <w:t>cURL</w:t>
-            </w:r>
-            <w:proofErr w:type="spellEnd"/>
-            <w:r>
-              <w:rPr>
-                <w:rFonts w:ascii="Arial" w:hAnsi="Arial"/>
-                <w:color w:val="000000"/>
-                <w:sz w:val="19"/>
-                <w:lang w:val="es-EC"/>
-              </w:rPr>
-              <w:t xml:space="preserve"> hacia la API de Zotero (api.zotero.org) para posibilitar el correcto funcionamiento de la sincronización de las publicaciones científic</w:t>
-            </w:r>
-            <w:r>
-              <w:rPr>
-                <w:rFonts w:ascii="Arial" w:hAnsi="Arial"/>
-                <w:color w:val="000000"/>
-                <w:sz w:val="19"/>
-                <w:lang w:val="es-EC"/>
-              </w:rPr>
-              <w:t xml:space="preserve">as del grupo en la página web mediante el plugin </w:t>
-            </w:r>
-            <w:proofErr w:type="spellStart"/>
-            <w:r>
-              <w:rPr>
-                <w:rFonts w:ascii="Arial" w:hAnsi="Arial"/>
-                <w:color w:val="000000"/>
-                <w:sz w:val="19"/>
-                <w:lang w:val="es-EC"/>
-              </w:rPr>
-              <w:t>Zotpress</w:t>
-            </w:r>
-            <w:proofErr w:type="spellEnd"/>
-            <w:r>
-              <w:rPr>
-                <w:rFonts w:ascii="Arial" w:hAnsi="Arial"/>
-                <w:color w:val="000000"/>
-                <w:sz w:val="19"/>
-                <w:lang w:val="es-EC"/>
-              </w:rPr>
-              <w:t>.</w:t>
+              <w:t xml:space="preserve">La página web del grupo es un desarrollo estático (HTML, CSS, JavaScript) que se conecta a la API pública de Zotero (api.zotero.org) directamente desde el navegador de los usuarios para mostrar y filtrar las publicaciones en tiempo real. Por ello, no requiere base de datos MySQL, procesamiento PHP en servidor, ni permisos de red especiales para el servidor de la UCO (las peticiones las realiza el cliente).</w:t>
             </w:r>
           </w:p>
         </w:tc>
@@ -752,7 +674,7 @@
                 <w:color w:val="000000"/>
                 <w:lang w:val="es-EC"/>
               </w:rPr>
-              <w:t>7</w:t>
+              <w:t>13</w:t>
             </w:r>
             <w:r>
               <w:rPr>
@@ -895,7 +817,7 @@
                 <w:color w:val="000000"/>
                 <w:lang w:val="es-EC"/>
               </w:rPr>
-              <w:t>ficotur@uco.es</w:t>
+              <w:t>ficotur@uco.es, z42gaapl@uco.es</w:t>
             </w:r>
           </w:p>
         </w:tc>

</xml_diff>